<commit_message>
chore: tooltips Area/US TEXT + tutorial 36 (10 langs) + DOCX exports
Three housekeeping tasks bundled in one commit:

1. Tooltips on Area + US fields in Scheda US clarify the values must be
   entered as TEXT, not integer. Translated in all 10 languages
   (it/en/de/fr/es/ar/ca/ro/pt/el) via .ts/.qm files. Compiled with
   pyside6-lrelease.

2. New tutorial 36 "Extended Matrix Export & s3dgraphy Bridge" added in
   all 10 languages (docs/tutorials/{lang}/36_extended_matrix_s3dgraphy.md).
   Registered in both viewers:
   - tabs/Tutorial_viewer.py::TUTORIALS_METADATA (10 langs)
   - pyarchinitDockWidget.py::TUTORIALS_METADATA (6 langs supported)
   Sphinx index.rst updated for 7 langs (it/en/de/fr/es/ar/ca);
   ro/pt/el have no index.rst (pre-existing gap).

3. DOCX exports of all docs/superpowers/{specs,plans,dev-log} markdown
   files for sharing on Microsoft Teams. Generated via pandoc.
</commit_message>
<xml_diff>
--- a/docs/superpowers/specs/2026-05-07-ai03-graphml-delegation-design.docx
+++ b/docs/superpowers/specs/2026-05-07-ai03-graphml-delegation-design.docx
@@ -2,7 +2,7 @@
 <file path=word/document.xml><?xml version="1.0" encoding="utf-8"?>
 <w:document xmlns:w="http://schemas.openxmlformats.org/wordprocessingml/2006/main" xmlns:m="http://schemas.openxmlformats.org/officeDocument/2006/math" xmlns:r="http://schemas.openxmlformats.org/officeDocument/2006/relationships" xmlns:o="urn:schemas-microsoft-com:office:office" xmlns:v="urn:schemas-microsoft-com:vml" xmlns:w10="urn:schemas-microsoft-com:office:word" xmlns:a="http://schemas.openxmlformats.org/drawingml/2006/main" xmlns:pic="http://schemas.openxmlformats.org/drawingml/2006/picture" xmlns:wp="http://schemas.openxmlformats.org/drawingml/2006/wordprocessingDrawing">
   <w:body>
-    <w:bookmarkStart w:id="26" w:name="Xb2898796e2a88b483d76bc2c5450a5569a0843c"/>
+    <w:bookmarkStart w:id="26" w:name="X5b26a1b2b9eddd866c11c3272e4d6851169d6f8"/>
     <w:p>
       <w:pPr>
         <w:pStyle w:val="Heading1"/>
@@ -135,7 +135,7 @@
         <w:t xml:space="preserve">Phase 2 (Local graph layer), AI03 standalone — AI04 and AI05 follow as separate releases</w:t>
       </w:r>
     </w:p>
-    <w:bookmarkStart w:id="9" w:name="goal"/>
+    <w:bookmarkStart w:id="9" w:name="X0af839049bce4318bae9565991c1a7a4bac4828"/>
     <w:p>
       <w:pPr>
         <w:pStyle w:val="Heading2"/>
@@ -149,7 +149,7 @@
         <w:pStyle w:val="FirstParagraph"/>
       </w:pPr>
       <w:r>
-        <w:t xml:space="preserve">Replace pyarchinit’s broken DOT → GraphML pipeline (which is the root cause of</w:t>
+        <w:t xml:space="preserve">Replace pyarchinit's broken DOT → GraphML pipeline (which is the root cause of</w:t>
       </w:r>
       <w:r>
         <w:t xml:space="preserve"> </w:t>
@@ -237,7 +237,7 @@
       </w:r>
     </w:p>
     <w:bookmarkEnd w:id="9"/>
-    <w:bookmarkStart w:id="10" w:name="decisions-captured-during-brainstorming"/>
+    <w:bookmarkStart w:id="10" w:name="Xf33fdeec0932b083d0da7052549d6d029d1fee0"/>
     <w:p>
       <w:pPr>
         <w:pStyle w:val="Heading2"/>
@@ -249,8 +249,7 @@
     <w:tbl>
       <w:tblPr>
         <w:tblStyle w:val="Table"/>
-        <w:tblW w:type="pct" w:w="5000"/>
-        <w:tblLayout w:type="fixed"/>
+        <w:tblW w:type="auto" w:w="0"/>
         <w:tblLook w:firstRow="1" w:lastRow="0" w:firstColumn="0" w:lastColumn="0" w:noHBand="0" w:noVBand="0" w:val="0020"/>
       </w:tblPr>
       <w:tblGrid>
@@ -570,13 +569,7 @@
               <w:pStyle w:val="Compact"/>
             </w:pPr>
             <w:r>
-              <w:t xml:space="preserve">“Configure spatial/functional groupings”</w:t>
-            </w:r>
-            <w:r>
-              <w:t xml:space="preserve"> </w:t>
-            </w:r>
-            <w:r>
-              <w:t xml:space="preserve">UI</w:t>
+              <w:t xml:space="preserve">"Configure spatial/functional groupings" UI</w:t>
             </w:r>
           </w:p>
         </w:tc>
@@ -611,13 +604,7 @@
               <w:pStyle w:val="Compact"/>
             </w:pPr>
             <w:r>
-              <w:t xml:space="preserve">“Bake auxiliary data”</w:t>
-            </w:r>
-            <w:r>
-              <w:t xml:space="preserve"> </w:t>
-            </w:r>
-            <w:r>
-              <w:t xml:space="preserve">UI toggle</w:t>
+              <w:t xml:space="preserve">"Bake auxiliary data" UI toggle</w:t>
             </w:r>
           </w:p>
         </w:tc>
@@ -678,31 +665,7 @@
               <w:pStyle w:val="Compact"/>
             </w:pPr>
             <w:r>
-              <w:t xml:space="preserve">New</w:t>
-            </w:r>
-            <w:r>
-              <w:t xml:space="preserve"> </w:t>
-            </w:r>
-            <w:r>
-              <w:rPr>
-                <w:rStyle w:val="VerbatimChar"/>
-              </w:rPr>
-              <w:t xml:space="preserve">db_manager.get_sqlite_path() -&gt; Path | None</w:t>
-            </w:r>
-            <w:r>
-              <w:t xml:space="preserve">. PostgreSQL returns</w:t>
-            </w:r>
-            <w:r>
-              <w:t xml:space="preserve"> </w:t>
-            </w:r>
-            <w:r>
-              <w:rPr>
-                <w:rStyle w:val="VerbatimChar"/>
-              </w:rPr>
-              <w:t xml:space="preserve">None</w:t>
-            </w:r>
-            <w:r>
-              <w:t xml:space="preserve">, GraphML branch logs an Info message and skips, DOT/JSON still produced. PostgreSQL GraphML support is AI04</w:t>
+              <w:t xml:space="preserve">New `db_manager.get_sqlite_path() -&gt; Path</w:t>
             </w:r>
           </w:p>
         </w:tc>
@@ -830,7 +793,7 @@
       </w:tr>
     </w:tbl>
     <w:bookmarkEnd w:id="10"/>
-    <w:bookmarkStart w:id="14" w:name="architecture"/>
+    <w:bookmarkStart w:id="14" w:name="Xdfcbf2b030bdbb2f92dca4d5f41df51f953baaf"/>
     <w:p>
       <w:pPr>
         <w:pStyle w:val="Heading2"/>
@@ -839,7 +802,7 @@
         <w:t xml:space="preserve">3. Architecture</w:t>
       </w:r>
     </w:p>
-    <w:bookmarkStart w:id="11" w:name="current-path-legacy-broken"/>
+    <w:bookmarkStart w:id="11" w:name="Xc63280b8908e778021e75f9c17e1b3d994539d7"/>
     <w:p>
       <w:pPr>
         <w:pStyle w:val="Heading3"/>
@@ -1004,7 +967,7 @@
       </w:r>
     </w:p>
     <w:bookmarkEnd w:id="11"/>
-    <w:bookmarkStart w:id="12" w:name="new-path-ai03-cut-over"/>
+    <w:bookmarkStart w:id="12" w:name="X7a313ec04e93627d776bd4ab7005aa9b0b5ff0d"/>
     <w:p>
       <w:pPr>
         <w:pStyle w:val="Heading3"/>
@@ -1223,7 +1186,7 @@
       </w:r>
     </w:p>
     <w:bookmarkEnd w:id="12"/>
-    <w:bookmarkStart w:id="13" w:name="code-removed-in-this-release"/>
+    <w:bookmarkStart w:id="13" w:name="Xf07dd0dfd58fec37cc684eeb2fbfcb65b9063df"/>
     <w:p>
       <w:pPr>
         <w:pStyle w:val="Heading3"/>
@@ -1506,7 +1469,7 @@
     </w:p>
     <w:bookmarkEnd w:id="13"/>
     <w:bookmarkEnd w:id="14"/>
-    <w:bookmarkStart w:id="15" w:name="components"/>
+    <w:bookmarkStart w:id="15" w:name="X7b2856f1d45f255ef1069486da7e2b48fe93fcc"/>
     <w:p>
       <w:pPr>
         <w:pStyle w:val="Heading2"/>
@@ -1518,8 +1481,7 @@
     <w:tbl>
       <w:tblPr>
         <w:tblStyle w:val="Table"/>
-        <w:tblW w:type="pct" w:w="5000"/>
-        <w:tblLayout w:type="fixed"/>
+        <w:tblW w:type="auto" w:w="0"/>
         <w:tblLook w:firstRow="1" w:lastRow="0" w:firstColumn="0" w:lastColumn="0" w:noHBand="0" w:noVBand="0" w:val="0020"/>
       </w:tblPr>
       <w:tblGrid>
@@ -2277,14 +2239,14 @@
               <w:t xml:space="preserve">build_mini_volterra.py</w:t>
             </w:r>
             <w:r>
-              <w:t xml:space="preserve">; kept in repo so tests don’t regenerate it on every run</w:t>
+              <w:t xml:space="preserve">; kept in repo so tests don't regenerate it on every run</w:t>
             </w:r>
           </w:p>
         </w:tc>
       </w:tr>
     </w:tbl>
     <w:bookmarkEnd w:id="15"/>
-    <w:bookmarkStart w:id="16" w:name="data-flow"/>
+    <w:bookmarkStart w:id="16" w:name="Xd15651d38ebd5ef29ef504e5d2867802100740e"/>
     <w:p>
       <w:pPr>
         <w:pStyle w:val="Heading2"/>
@@ -2298,19 +2260,7 @@
         <w:pStyle w:val="FirstParagraph"/>
       </w:pPr>
       <w:r>
-        <w:t xml:space="preserve">The dialog flow at the green</w:t>
-      </w:r>
-      <w:r>
-        <w:t xml:space="preserve"> </w:t>
-      </w:r>
-      <w:r>
-        <w:t xml:space="preserve">“Extended Matrix”</w:t>
-      </w:r>
-      <w:r>
-        <w:t xml:space="preserve"> </w:t>
-      </w:r>
-      <w:r>
-        <w:t xml:space="preserve">button:</w:t>
+        <w:t xml:space="preserve">The dialog flow at the green "Extended Matrix" button:</w:t>
       </w:r>
     </w:p>
     <w:p>
@@ -2551,16 +2501,7 @@
         <w:t xml:space="preserve"> </w:t>
       </w:r>
       <w:r>
-        <w:t xml:space="preserve">(PostgreSQL): log Info, skip GraphML, mark per_format_status as</w:t>
-      </w:r>
-      <w:r>
-        <w:t xml:space="preserve"> </w:t>
-      </w:r>
-      <w:r>
-        <w:t xml:space="preserve">“skipped: PG support in AI04”</w:t>
-      </w:r>
-      <w:r>
-        <w:t xml:space="preserve">. Continue to step 7.</w:t>
+        <w:t xml:space="preserve">(PostgreSQL): log Info, skip GraphML, mark per_format_status as "skipped: PG support in AI04". Continue to step 7.</w:t>
       </w:r>
     </w:p>
     <w:p>
@@ -2967,14 +2908,17 @@
         <w:t xml:space="preserve"> </w:t>
       </w:r>
       <w:r>
-        <w:t xml:space="preserve">with one line per format describing what was produced (path, metrics) or what failed (error class + reason). Format the GraphML line as e.g. </w:t>
+        <w:t xml:space="preserve">with one line per format describing what was produced (path, metrics) or what failed (error class + reason). Format the GraphML line as e.g.</w:t>
+      </w:r>
+      <w:r>
+        <w:t xml:space="preserve"> </w:t>
       </w:r>
       <w:r>
         <w:rPr>
           <w:i/>
           <w:iCs/>
         </w:rPr>
-        <w:t xml:space="preserve">“GraphML exported: 298 nodes, 5 epochs, 655 → 412 edges (243 redundancies removed by transitive reduction), 0 warnings.”</w:t>
+        <w:t xml:space="preserve">"GraphML exported: 298 nodes, 5 epochs, 655 → 412 edges (243 redundancies removed by transitive reduction), 0 warnings."</w:t>
       </w:r>
     </w:p>
     <w:p>
@@ -2988,7 +2932,7 @@
         <w:t xml:space="preserve">GraphMLExporter</w:t>
       </w:r>
       <w:r>
-        <w:t xml:space="preserve">’s internal</w:t>
+        <w:t xml:space="preserve">'s internal</w:t>
       </w:r>
       <w:r>
         <w:t xml:space="preserve"> </w:t>
@@ -3022,7 +2966,7 @@
       </w:r>
     </w:p>
     <w:bookmarkEnd w:id="16"/>
-    <w:bookmarkStart w:id="17" w:name="error-handling"/>
+    <w:bookmarkStart w:id="17" w:name="X263082721bea3ec65046e5d9ecdeecae35f702b"/>
     <w:p>
       <w:pPr>
         <w:pStyle w:val="Heading2"/>
@@ -3042,8 +2986,7 @@
     <w:tbl>
       <w:tblPr>
         <w:tblStyle w:val="Table"/>
-        <w:tblW w:type="pct" w:w="5000"/>
-        <w:tblLayout w:type="fixed"/>
+        <w:tblW w:type="auto" w:w="0"/>
         <w:tblLook w:firstRow="1" w:lastRow="0" w:firstColumn="0" w:lastColumn="0" w:noHBand="0" w:noVBand="0" w:val="0020"/>
       </w:tblPr>
       <w:tblGrid>
@@ -3160,16 +3103,7 @@
               <w:pStyle w:val="Compact"/>
             </w:pPr>
             <w:r>
-              <w:t xml:space="preserve">Log Info, skip only GraphML, summary dialog notes</w:t>
-            </w:r>
-            <w:r>
-              <w:t xml:space="preserve"> </w:t>
-            </w:r>
-            <w:r>
-              <w:t xml:space="preserve">“PG support in AI04”</w:t>
-            </w:r>
-            <w:r>
-              <w:t xml:space="preserve">. DOT/JSON still produced</w:t>
+              <w:t xml:space="preserve">Log Info, skip only GraphML, summary dialog notes "PG support in AI04". DOT/JSON still produced</w:t>
             </w:r>
           </w:p>
         </w:tc>
@@ -3224,16 +3158,7 @@
               <w:pStyle w:val="Compact"/>
             </w:pPr>
             <w:r>
-              <w:t xml:space="preserve">Log Warning with path, summary dialog</w:t>
-            </w:r>
-            <w:r>
-              <w:t xml:space="preserve"> </w:t>
-            </w:r>
-            <w:r>
-              <w:t xml:space="preserve">“GraphML failed: DB not found”</w:t>
-            </w:r>
-            <w:r>
-              <w:t xml:space="preserve">, DOT/JSON not touched</w:t>
+              <w:t xml:space="preserve">Log Warning with path, summary dialog "GraphML failed: DB not found", DOT/JSON not touched</w:t>
             </w:r>
           </w:p>
         </w:tc>
@@ -3400,13 +3325,7 @@
               <w:pStyle w:val="Compact"/>
             </w:pPr>
             <w:r>
-              <w:t xml:space="preserve">Log Warning, summary</w:t>
-            </w:r>
-            <w:r>
-              <w:t xml:space="preserve"> </w:t>
-            </w:r>
-            <w:r>
-              <w:t xml:space="preserve">“GraphML mapping missing — please reinstall plugin”</w:t>
+              <w:t xml:space="preserve">Log Warning, summary "GraphML mapping missing — please reinstall plugin"</w:t>
             </w:r>
           </w:p>
         </w:tc>
@@ -3537,25 +3456,10 @@
               <w:t xml:space="preserve">EmptyGraphError</w:t>
             </w:r>
             <w:r>
-              <w:t xml:space="preserve">, summary</w:t>
-            </w:r>
-            <w:r>
-              <w:t xml:space="preserve"> </w:t>
-            </w:r>
-            <w:r>
-              <w:t xml:space="preserve">“No US records for site</w:t>
-            </w:r>
-            <w:r>
-              <w:t xml:space="preserve"> </w:t>
-            </w:r>
-            <w:r>
-              <w:t xml:space="preserve">‘</w:t>
-            </w:r>
-            <w:r>
-              <w:t xml:space="preserve">’</w:t>
-            </w:r>
-            <w:r>
-              <w:t xml:space="preserve">”</w:t>
+              <w:t xml:space="preserve">, summary "No US records for site '</w:t>
+            </w:r>
+            <w:r>
+              <w:t xml:space="preserve">'"</w:t>
             </w:r>
           </w:p>
         </w:tc>
@@ -3737,19 +3641,13 @@
               <w:t xml:space="preserve">GraphMLExportError('write', original)</w:t>
             </w:r>
             <w:r>
-              <w:t xml:space="preserve">, log Critical, summary</w:t>
-            </w:r>
-            <w:r>
-              <w:t xml:space="preserve"> </w:t>
-            </w:r>
-            <w:r>
-              <w:t xml:space="preserve">“Failed to write GraphML to</w:t>
-            </w:r>
-            <w:r>
-              <w:t xml:space="preserve"> </w:t>
-            </w:r>
-            <w:r>
-              <w:t xml:space="preserve">”</w:t>
+              <w:t xml:space="preserve">, log Critical, summary "Failed to write GraphML to</w:t>
+            </w:r>
+            <w:r>
+              <w:t xml:space="preserve"> </w:t>
+            </w:r>
+            <w:r>
+              <w:t xml:space="preserve">"</w:t>
             </w:r>
           </w:p>
         </w:tc>
@@ -3819,13 +3717,7 @@
               <w:t xml:space="preserve">GraphMLExportError('export', original)</w:t>
             </w:r>
             <w:r>
-              <w:t xml:space="preserve">, log full traceback in QGIS log panel for bug reports, summary</w:t>
-            </w:r>
-            <w:r>
-              <w:t xml:space="preserve"> </w:t>
-            </w:r>
-            <w:r>
-              <w:t xml:space="preserve">“GraphML export failed:</w:t>
+              <w:t xml:space="preserve">, log full traceback in QGIS log panel for bug reports, summary "GraphML export failed:</w:t>
             </w:r>
             <w:r>
               <w:t xml:space="preserve"> </w:t>
@@ -3837,25 +3729,7 @@
               <w:t xml:space="preserve"> </w:t>
             </w:r>
             <w:r>
-              <w:t xml:space="preserve">”</w:t>
-            </w:r>
-            <w:r>
-              <w:t xml:space="preserve"> </w:t>
-            </w:r>
-            <w:r>
-              <w:t xml:space="preserve">with a</w:t>
-            </w:r>
-            <w:r>
-              <w:t xml:space="preserve"> </w:t>
-            </w:r>
-            <w:r>
-              <w:t xml:space="preserve">“Show details”</w:t>
-            </w:r>
-            <w:r>
-              <w:t xml:space="preserve"> </w:t>
-            </w:r>
-            <w:r>
-              <w:t xml:space="preserve">button that opens the log panel</w:t>
+              <w:t xml:space="preserve">" with a "Show details" button that opens the log panel</w:t>
             </w:r>
           </w:p>
         </w:tc>
@@ -4253,7 +4127,7 @@
       </w:r>
     </w:p>
     <w:bookmarkEnd w:id="17"/>
-    <w:bookmarkStart w:id="22" w:name="testing-strategy"/>
+    <w:bookmarkStart w:id="22" w:name="Xd448acc5e3b8fbb8d6bc0297f6ecc02d0b42894"/>
     <w:p>
       <w:pPr>
         <w:pStyle w:val="Heading2"/>
@@ -4262,7 +4136,7 @@
         <w:t xml:space="preserve">7. Testing strategy</w:t>
       </w:r>
     </w:p>
-    <w:bookmarkStart w:id="18" w:name="levels"/>
+    <w:bookmarkStart w:id="18" w:name="X73aea3d1356a113350df08931f90a77cce02925"/>
     <w:p>
       <w:pPr>
         <w:pStyle w:val="Heading3"/>
@@ -4274,8 +4148,7 @@
     <w:tbl>
       <w:tblPr>
         <w:tblStyle w:val="Table"/>
-        <w:tblW w:type="pct" w:w="5000"/>
-        <w:tblLayout w:type="fixed"/>
+        <w:tblW w:type="auto" w:w="0"/>
         <w:tblLook w:firstRow="1" w:lastRow="0" w:firstColumn="0" w:lastColumn="0" w:noHBand="0" w:noVBand="0" w:val="0020"/>
       </w:tblPr>
       <w:tblGrid>
@@ -4554,7 +4427,7 @@
       </w:tr>
     </w:tbl>
     <w:bookmarkEnd w:id="18"/>
-    <w:bookmarkStart w:id="19" w:name="the-four-l2-tests-acceptance-criteria"/>
+    <w:bookmarkStart w:id="19" w:name="X3f8c79bc241a2b0ffd54bf1138c25d71d5ddd54"/>
     <w:p>
       <w:pPr>
         <w:pStyle w:val="Heading3"/>
@@ -4845,7 +4718,7 @@
       </w:r>
     </w:p>
     <w:bookmarkEnd w:id="19"/>
-    <w:bookmarkStart w:id="20" w:name="the-fixture"/>
+    <w:bookmarkStart w:id="20" w:name="Xacd585a6dd4bb92795ea8e5f78defb9a3bf03ac"/>
     <w:p>
       <w:pPr>
         <w:pStyle w:val="Heading3"/>
@@ -5072,7 +4945,10 @@
         <w:t xml:space="preserve"> </w:t>
       </w:r>
       <w:r>
-        <w:t xml:space="preserve">(e.g. </w:t>
+        <w:t xml:space="preserve">(e.g.</w:t>
+      </w:r>
+      <w:r>
+        <w:t xml:space="preserve"> </w:t>
       </w:r>
       <w:r>
         <w:rPr>
@@ -5278,7 +5154,7 @@
       </w:r>
     </w:p>
     <w:bookmarkEnd w:id="20"/>
-    <w:bookmarkStart w:id="21" w:name="manual-smoke-gate"/>
+    <w:bookmarkStart w:id="21" w:name="X8c16e3a88ec93948bb2e59a3c060e2101f06922"/>
     <w:p>
       <w:pPr>
         <w:pStyle w:val="Heading3"/>
@@ -5328,19 +5204,7 @@
         </w:numPr>
       </w:pPr>
       <w:r>
-        <w:t xml:space="preserve">Click the green</w:t>
-      </w:r>
-      <w:r>
-        <w:t xml:space="preserve"> </w:t>
-      </w:r>
-      <w:r>
-        <w:t xml:space="preserve">“Extended Matrix”</w:t>
-      </w:r>
-      <w:r>
-        <w:t xml:space="preserve"> </w:t>
-      </w:r>
-      <w:r>
-        <w:t xml:space="preserve">button → Export with default checkboxes.</w:t>
+        <w:t xml:space="preserve">Click the green "Extended Matrix" button → Export with default checkboxes.</w:t>
       </w:r>
     </w:p>
     <w:p>
@@ -5539,7 +5403,7 @@
     </w:p>
     <w:bookmarkEnd w:id="21"/>
     <w:bookmarkEnd w:id="22"/>
-    <w:bookmarkStart w:id="23" w:name="acceptance-criteria"/>
+    <w:bookmarkStart w:id="23" w:name="Xe67ed08d33e88c78a18efc248374eb25e55c76d"/>
     <w:p>
       <w:pPr>
         <w:pStyle w:val="Heading2"/>
@@ -5819,7 +5683,7 @@
       </w:r>
     </w:p>
     <w:bookmarkEnd w:id="23"/>
-    <w:bookmarkStart w:id="24" w:name="out-of-scope"/>
+    <w:bookmarkStart w:id="24" w:name="Xe90ec7d73b2b725d421cb7672724f3aeef0b8fb"/>
     <w:p>
       <w:pPr>
         <w:pStyle w:val="Heading2"/>
@@ -6095,7 +5959,7 @@
       </w:r>
     </w:p>
     <w:bookmarkEnd w:id="24"/>
-    <w:bookmarkStart w:id="25" w:name="references"/>
+    <w:bookmarkStart w:id="25" w:name="X3b4c3db7819ed66f453f0c9b146c43e80460b49"/>
     <w:p>
       <w:pPr>
         <w:pStyle w:val="Heading2"/>
@@ -6149,16 +6013,7 @@
         <w:t xml:space="preserve">~/Downloads/T5.4_PyArchInit_s3Dgraphy_Reference_v0.1.pdf</w:t>
       </w:r>
       <w:r>
-        <w:t xml:space="preserve">. §3 confirms</w:t>
-      </w:r>
-      <w:r>
-        <w:t xml:space="preserve"> </w:t>
-      </w:r>
-      <w:r>
-        <w:t xml:space="preserve">“the GraphML writer belongs to s3Dgraphy”</w:t>
-      </w:r>
-      <w:r>
-        <w:t xml:space="preserve">; §4.5 confirms Option B (per-tool JSON parsing, library owns serialisation); §6 division-of-responsibilities table puts GraphML serialisation on s3Dgraphy’s side.</w:t>
+        <w:t xml:space="preserve">. §3 confirms "the GraphML writer belongs to s3Dgraphy"; §4.5 confirms Option B (per-tool JSON parsing, library owns serialisation); §6 division-of-responsibilities table puts GraphML serialisation on s3Dgraphy's side.</w:t>
       </w:r>
     </w:p>
     <w:p>
@@ -6185,13 +6040,7 @@
         <w:t xml:space="preserve"> </w:t>
       </w:r>
       <w:r>
-        <w:t xml:space="preserve">§7.6 (</w:t>
-      </w:r>
-      <w:r>
-        <w:t xml:space="preserve">“Drop the in-house GraphML writer (delegate to s3dgraphy)”</w:t>
-      </w:r>
-      <w:r>
-        <w:t xml:space="preserve">) and §11 (Phase 2 deliverable).</w:t>
+        <w:t xml:space="preserve">§7.6 ("Drop the in-house GraphML writer (delegate to s3dgraphy)") and §11 (Phase 2 deliverable).</w:t>
       </w:r>
     </w:p>
     <w:p>
@@ -6215,19 +6064,7 @@
         <w:t xml:space="preserve">docs/superpowers/dev-log/T5.4_PyArchInit_Dev_Log.md</w:t>
       </w:r>
       <w:r>
-        <w:t xml:space="preserve">,</w:t>
-      </w:r>
-      <w:r>
-        <w:t xml:space="preserve"> </w:t>
-      </w:r>
-      <w:r>
-        <w:t xml:space="preserve">“Phase 1 known limitations carried over to Phase 2 / AI03”</w:t>
-      </w:r>
-      <w:r>
-        <w:t xml:space="preserve"> </w:t>
-      </w:r>
-      <w:r>
-        <w:t xml:space="preserve">section listing the four limitations this spec closes.</w:t>
+        <w:t xml:space="preserve">, "Phase 1 known limitations carried over to Phase 2 / AI03" section listing the four limitations this spec closes.</w:t>
       </w:r>
     </w:p>
     <w:p>

</xml_diff>